<commit_message>
Sync phrases, batch render, performance, and documentation.
Add standard phrases (catalog, resolver, Streamlit panel), multi-row ProjectData batch
generation, engine/UI caching optimizations, Phase I PDF-to-markup tooling, scoped
Cursor rules, and expanded test suite (93 tests). Update docs and gitignore for
client reference samples.

Co-authored-by: Cursor <cursoragent@cursor.com>
</commit_message>
<xml_diff>
--- a/samples/phase1_alberta_template.docx
+++ b/samples/phase1_alberta_template.docx
@@ -89,7 +89,17 @@
     </w:p>
     <w:p>
       <w:r>
+        <w:t>{{ drilling_waste_intro }}</w:t>
+      </w:r>
+    </w:p>
+    <w:p>
+      <w:r>
         <w:t>{{ drilling_waste_summary }}</w:t>
+      </w:r>
+    </w:p>
+    <w:p>
+      <w:r>
+        <w:t>{{ site_recon_intro }}</w:t>
       </w:r>
     </w:p>
     <w:p>
@@ -110,6 +120,11 @@
     <w:p>
       <w:r>
         <w:t>Phase II ESA required: {{ phase2_esa_required }}</w:t>
+      </w:r>
+    </w:p>
+    <w:p>
+      <w:r>
+        <w:t>{{ phase2_recommendation }}</w:t>
       </w:r>
     </w:p>
     <w:p>

</xml_diff>

<commit_message>
Align Phase I Alberta workflow with AER SED 002 Section 10 and improve render performance.
Add SED 002 checklist, compliance preflight, Phase II decision heuristics, OneStop export bundle, Devon sample pair, and faster single-pass template/Excel parsing.

Co-authored-by: Cursor <cursoragent@cursor.com>
</commit_message>
<xml_diff>
--- a/samples/phase1_alberta_template.docx
+++ b/samples/phase1_alberta_template.docx
@@ -64,7 +64,33 @@
         <w:pStyle w:val="Heading1"/>
       </w:pPr>
       <w:r>
-        <w:t>AER Schedule Two — Phase I ESA (summary)</w:t>
+        <w:t>SED 002 — Phase 1 ESA (Section 10)</w:t>
+      </w:r>
+    </w:p>
+    <w:p>
+      <w:pPr>
+        <w:pStyle w:val="Heading2"/>
+      </w:pPr>
+      <w:r>
+        <w:t>10.1 Asset information</w:t>
+      </w:r>
+    </w:p>
+    <w:p>
+      <w:r>
+        <w:t>Activity type: {{ asset_activity_type }}</w:t>
+      </w:r>
+    </w:p>
+    <w:p>
+      <w:r>
+        <w:t>Prior reclamation certificate: {{ prior_reclamation_cert_number }}</w:t>
+      </w:r>
+    </w:p>
+    <w:p>
+      <w:pPr>
+        <w:pStyle w:val="Heading2"/>
+      </w:pPr>
+      <w:r>
+        <w:t>10.2 Drilling information</w:t>
       </w:r>
     </w:p>
     <w:p>
@@ -74,17 +100,40 @@
     </w:p>
     <w:p>
       <w:r>
-        <w:t>Spud: {{ spud_date }} | Final drill: {{ final_drill_date }} | TD: {{ well_depth_m }} m</w:t>
+        <w:t>Spud: {{ spud_date }} | Cased: {{ cased_date }} | Final drill: {{ final_drill_date }}</w:t>
       </w:r>
     </w:p>
     <w:p>
       <w:r>
-        <w:t>Status: {{ well_status }} | Re-entry: {{ reentry }} | Fluid: {{ production_fluid }}</w:t>
+        <w:t>TD: {{ well_depth_m }} m | Status: {{ well_status }} | Re-entry: {{ reentry }}</w:t>
       </w:r>
     </w:p>
     <w:p>
       <w:r>
-        <w:t>Drilling waste (AER): {{ aer_waste_compliance_option }}</w:t>
+        <w:t>{{ reentry_detail }}</w:t>
+      </w:r>
+    </w:p>
+    <w:p>
+      <w:r>
+        <w:t>Production fluid: {{ production_fluid }}</w:t>
+      </w:r>
+    </w:p>
+    <w:p>
+      <w:pPr>
+        <w:pStyle w:val="Heading2"/>
+      </w:pPr>
+      <w:r>
+        <w:t>10.4 Drilling waste disposal</w:t>
+      </w:r>
+    </w:p>
+    <w:p>
+      <w:r>
+        <w:t>Compliance option: {{ aer_waste_compliance_option }}</w:t>
+      </w:r>
+    </w:p>
+    <w:p>
+      <w:r>
+        <w:t>No drilling waste on site: {{ no_drilling_waste_on_site }}</w:t>
       </w:r>
     </w:p>
     <w:p>
@@ -97,58 +146,10 @@
         <w:t>{{ drilling_waste_summary }}</w:t>
       </w:r>
     </w:p>
-    <w:p>
-      <w:r>
-        <w:t>{{ site_recon_intro }}</w:t>
-      </w:r>
-    </w:p>
-    <w:p>
-      <w:r>
-        <w:t>Infrastructure: {{ infrastructure_summary }}</w:t>
-      </w:r>
-    </w:p>
-    <w:p>
-      <w:r>
-        <w:t>Spills/releases: {{ spills_releases }}</w:t>
-      </w:r>
-    </w:p>
-    <w:p>
-      <w:r>
-        <w:t>Site visit completed: {{ site_visit_completed }}</w:t>
-      </w:r>
-    </w:p>
-    <w:p>
-      <w:r>
-        <w:t>Phase II ESA required: {{ phase2_esa_required }}</w:t>
-      </w:r>
-    </w:p>
-    <w:p>
-      <w:r>
-        <w:t>{{ phase2_recommendation }}</w:t>
-      </w:r>
-    </w:p>
-    <w:p>
-      <w:pPr>
-        <w:pStyle w:val="Heading1"/>
-      </w:pPr>
-      <w:r>
-        <w:t>Conclusions and Recommendations</w:t>
-      </w:r>
-    </w:p>
-    <w:p>
-      <w:r>
-        <w:t>{{ conclusions_recommendations }}</w:t>
-      </w:r>
-    </w:p>
-    <w:p>
-      <w:r>
-        <w:t>Prepared by: {{ prepared_by }} | Date: {{ date_of_issue }}</w:t>
-      </w:r>
-    </w:p>
     <w:p/>
     <w:p>
       <w:r>
-        <w:t>Drilling waste disposal:</w:t>
+        <w:t>Drilling waste disposal events:</w:t>
       </w:r>
     </w:p>
     <w:tbl>
@@ -158,15 +159,21 @@
         <w:tblLook w:firstColumn="1" w:firstRow="1" w:lastColumn="0" w:lastRow="0" w:noHBand="0" w:noVBand="1" w:val="04A0"/>
       </w:tblPr>
       <w:tblGrid>
-        <w:gridCol w:w="2160"/>
-        <w:gridCol w:w="2160"/>
-        <w:gridCol w:w="2160"/>
-        <w:gridCol w:w="2160"/>
+        <w:gridCol w:w="864"/>
+        <w:gridCol w:w="864"/>
+        <w:gridCol w:w="864"/>
+        <w:gridCol w:w="864"/>
+        <w:gridCol w:w="864"/>
+        <w:gridCol w:w="864"/>
+        <w:gridCol w:w="864"/>
+        <w:gridCol w:w="864"/>
+        <w:gridCol w:w="864"/>
+        <w:gridCol w:w="864"/>
       </w:tblGrid>
       <w:tr>
         <w:tc>
           <w:tcPr>
-            <w:tcW w:type="dxa" w:w="2160"/>
+            <w:tcW w:type="dxa" w:w="864"/>
           </w:tcPr>
           <w:p>
             <w:r>
@@ -176,7 +183,7 @@
         </w:tc>
         <w:tc>
           <w:tcPr>
-            <w:tcW w:type="dxa" w:w="2160"/>
+            <w:tcW w:type="dxa" w:w="864"/>
           </w:tcPr>
           <w:p>
             <w:r>
@@ -186,21 +193,81 @@
         </w:tc>
         <w:tc>
           <w:tcPr>
-            <w:tcW w:type="dxa" w:w="2160"/>
+            <w:tcW w:type="dxa" w:w="864"/>
           </w:tcPr>
           <w:p>
             <w:r>
-              <w:t>Disposal method</w:t>
+              <w:t>Disposal type</w:t>
             </w:r>
           </w:p>
         </w:tc>
         <w:tc>
           <w:tcPr>
-            <w:tcW w:type="dxa" w:w="2160"/>
+            <w:tcW w:type="dxa" w:w="864"/>
+          </w:tcPr>
+          <w:p>
+            <w:r>
+              <w:t>Method</w:t>
+            </w:r>
+          </w:p>
+        </w:tc>
+        <w:tc>
+          <w:tcPr>
+            <w:tcW w:type="dxa" w:w="864"/>
           </w:tcPr>
           <w:p>
             <w:r>
               <w:t>Location</w:t>
+            </w:r>
+          </w:p>
+        </w:tc>
+        <w:tc>
+          <w:tcPr>
+            <w:tcW w:type="dxa" w:w="864"/>
+          </w:tcPr>
+          <w:p>
+            <w:r>
+              <w:t>GPS</w:t>
+            </w:r>
+          </w:p>
+        </w:tc>
+        <w:tc>
+          <w:tcPr>
+            <w:tcW w:type="dxa" w:w="864"/>
+          </w:tcPr>
+          <w:p>
+            <w:r>
+              <w:t>Sump depth (m)</w:t>
+            </w:r>
+          </w:p>
+        </w:tc>
+        <w:tc>
+          <w:tcPr>
+            <w:tcW w:type="dxa" w:w="864"/>
+          </w:tcPr>
+          <w:p>
+            <w:r>
+              <w:t>Cover (m)</w:t>
+            </w:r>
+          </w:p>
+        </w:tc>
+        <w:tc>
+          <w:tcPr>
+            <w:tcW w:type="dxa" w:w="864"/>
+          </w:tcPr>
+          <w:p>
+            <w:r>
+              <w:t>Remote cert #</w:t>
+            </w:r>
+          </w:p>
+        </w:tc>
+        <w:tc>
+          <w:tcPr>
+            <w:tcW w:type="dxa" w:w="864"/>
+          </w:tcPr>
+          <w:p>
+            <w:r>
+              <w:t>Manifests</w:t>
             </w:r>
           </w:p>
         </w:tc>
@@ -209,7 +276,7 @@
         <w:tc>
           <w:tcPr>
             <w:tcW w:type="dxa" w:w="8640"/>
-            <w:gridSpan w:val="4"/>
+            <w:gridSpan w:val="10"/>
           </w:tcPr>
           <w:p>
             <w:r>
@@ -221,7 +288,7 @@
       <w:tr>
         <w:tc>
           <w:tcPr>
-            <w:tcW w:type="dxa" w:w="2160"/>
+            <w:tcW w:type="dxa" w:w="864"/>
           </w:tcPr>
           <w:p>
             <w:r>
@@ -231,7 +298,7 @@
         </w:tc>
         <w:tc>
           <w:tcPr>
-            <w:tcW w:type="dxa" w:w="2160"/>
+            <w:tcW w:type="dxa" w:w="864"/>
           </w:tcPr>
           <w:p>
             <w:r>
@@ -241,7 +308,17 @@
         </w:tc>
         <w:tc>
           <w:tcPr>
-            <w:tcW w:type="dxa" w:w="2160"/>
+            <w:tcW w:type="dxa" w:w="864"/>
+          </w:tcPr>
+          <w:p>
+            <w:r>
+              <w:t>{{ item.disposal_type }}</w:t>
+            </w:r>
+          </w:p>
+        </w:tc>
+        <w:tc>
+          <w:tcPr>
+            <w:tcW w:type="dxa" w:w="864"/>
           </w:tcPr>
           <w:p>
             <w:r>
@@ -251,11 +328,61 @@
         </w:tc>
         <w:tc>
           <w:tcPr>
-            <w:tcW w:type="dxa" w:w="2160"/>
+            <w:tcW w:type="dxa" w:w="864"/>
           </w:tcPr>
           <w:p>
             <w:r>
               <w:t>{{ item.location }}</w:t>
+            </w:r>
+          </w:p>
+        </w:tc>
+        <w:tc>
+          <w:tcPr>
+            <w:tcW w:type="dxa" w:w="864"/>
+          </w:tcPr>
+          <w:p>
+            <w:r>
+              <w:t>{{ item.gps_coordinates }}</w:t>
+            </w:r>
+          </w:p>
+        </w:tc>
+        <w:tc>
+          <w:tcPr>
+            <w:tcW w:type="dxa" w:w="864"/>
+          </w:tcPr>
+          <w:p>
+            <w:r>
+              <w:t>{{ item.sump_depth_m }}</w:t>
+            </w:r>
+          </w:p>
+        </w:tc>
+        <w:tc>
+          <w:tcPr>
+            <w:tcW w:type="dxa" w:w="864"/>
+          </w:tcPr>
+          <w:p>
+            <w:r>
+              <w:t>{{ item.cover_depth_m }}</w:t>
+            </w:r>
+          </w:p>
+        </w:tc>
+        <w:tc>
+          <w:tcPr>
+            <w:tcW w:type="dxa" w:w="864"/>
+          </w:tcPr>
+          <w:p>
+            <w:r>
+              <w:t>{{ item.remote_cert_number }}</w:t>
+            </w:r>
+          </w:p>
+        </w:tc>
+        <w:tc>
+          <w:tcPr>
+            <w:tcW w:type="dxa" w:w="864"/>
+          </w:tcPr>
+          <w:p>
+            <w:r>
+              <w:t>{{ item.waste_manifest_refs }}</w:t>
             </w:r>
           </w:p>
         </w:tc>
@@ -264,7 +391,7 @@
         <w:tc>
           <w:tcPr>
             <w:tcW w:type="dxa" w:w="8640"/>
-            <w:gridSpan w:val="4"/>
+            <w:gridSpan w:val="10"/>
           </w:tcPr>
           <w:p>
             <w:r>
@@ -274,6 +401,29 @@
         </w:tc>
       </w:tr>
     </w:tbl>
+    <w:p>
+      <w:pPr>
+        <w:pStyle w:val="Heading2"/>
+      </w:pPr>
+      <w:r>
+        <w:t>10.5 Production and storage</w:t>
+      </w:r>
+    </w:p>
+    <w:p>
+      <w:r>
+        <w:t>Infrastructure: {{ infrastructure_summary }}</w:t>
+      </w:r>
+    </w:p>
+    <w:p>
+      <w:r>
+        <w:t>Flare pit used: {{ flare_pit_used }}</w:t>
+      </w:r>
+    </w:p>
+    <w:p>
+      <w:r>
+        <w:t>Spills/releases: {{ spills_releases }}</w:t>
+      </w:r>
+    </w:p>
     <w:p/>
     <w:p>
       <w:r>
@@ -403,10 +553,102 @@
         </w:tc>
       </w:tr>
     </w:tbl>
+    <w:p>
+      <w:pPr>
+        <w:pStyle w:val="Heading2"/>
+      </w:pPr>
+      <w:r>
+        <w:t>10.6 Site visit</w:t>
+      </w:r>
+    </w:p>
+    <w:p>
+      <w:r>
+        <w:t>{{ site_recon_intro }}</w:t>
+      </w:r>
+    </w:p>
+    <w:p>
+      <w:r>
+        <w:t>Site visit completed: {{ site_visit_completed }} | Date: {{ site_visit_date }}</w:t>
+      </w:r>
+    </w:p>
+    <w:p>
+      <w:r>
+        <w:t>{{ site_visit_photo_notes }}</w:t>
+      </w:r>
+    </w:p>
+    <w:p>
+      <w:pPr>
+        <w:pStyle w:val="Heading2"/>
+      </w:pPr>
+      <w:r>
+        <w:t>10.7 Records review</w:t>
+      </w:r>
+    </w:p>
+    <w:p>
+      <w:r>
+        <w:t>{{ records_review_summary }}</w:t>
+      </w:r>
+    </w:p>
+    <w:p>
+      <w:r>
+        <w:t>Air photos: {{ air_photo_observations }}</w:t>
+      </w:r>
+    </w:p>
+    <w:p>
+      <w:pPr>
+        <w:pStyle w:val="Heading2"/>
+      </w:pPr>
+      <w:r>
+        <w:t>10.8 Interviews</w:t>
+      </w:r>
+    </w:p>
+    <w:p>
+      <w:r>
+        <w:t>Operator: {{ interview_operator_summary }}</w:t>
+      </w:r>
+    </w:p>
+    <w:p>
+      <w:r>
+        <w:t>Landowner: {{ interview_landowner_summary }}</w:t>
+      </w:r>
+    </w:p>
+    <w:p>
+      <w:pPr>
+        <w:pStyle w:val="Heading2"/>
+      </w:pPr>
+      <w:r>
+        <w:t>Conclusions and Phase II</w:t>
+      </w:r>
+    </w:p>
+    <w:p>
+      <w:r>
+        <w:t>Phase II ESA required: {{ phase2_esa_required }}</w:t>
+      </w:r>
+    </w:p>
+    <w:p>
+      <w:r>
+        <w:t>Phase II recommended (rules): {{ phase2_recommended }}</w:t>
+      </w:r>
+    </w:p>
+    <w:p>
+      <w:r>
+        <w:t>{{ phase2_recommendation }}</w:t>
+      </w:r>
+    </w:p>
+    <w:p>
+      <w:r>
+        <w:t>{{ conclusions_recommendations }}</w:t>
+      </w:r>
+    </w:p>
+    <w:p>
+      <w:r>
+        <w:t>Prepared by: {{ prepared_by }} | Date: {{ date_of_issue }}</w:t>
+      </w:r>
+    </w:p>
     <w:p/>
     <w:p>
       <w:r>
-        <w:t>Appendices A–F (AER forms, ABADATA, air photos, drilling waste, survey, land title) are attached separately to the deliverable package.</w:t>
+        <w:t>Appendices A–H (AER forms, ABADATA, air photos, drilling waste checklists, survey, land title, site sketch) are attached in the deliverable package.</w:t>
       </w:r>
     </w:p>
     <w:sectPr>

</xml_diff>

<commit_message>
Prepare Streamlit Community Cloud tester deploy.
Hosted mode reads Cloud secrets, remove localhost serverAddress, ship help/UX polish and platform modules needed for share.streamlit.io.

Co-authored-by: Cursor <cursoragent@cursor.com>
</commit_message>
<xml_diff>
--- a/samples/phase1_alberta_template.docx
+++ b/samples/phase1_alberta_template.docx
@@ -594,6 +594,219 @@
         <w:t>Air photos: {{ air_photo_observations }}</w:t>
       </w:r>
     </w:p>
+    <w:p/>
+    <w:p>
+      <w:r>
+        <w:t>Areas of potential environmental concern (APECs):</w:t>
+      </w:r>
+    </w:p>
+    <w:tbl>
+      <w:tblPr>
+        <w:tblStyle w:val="TableGrid"/>
+        <w:tblW w:type="auto" w:w="0"/>
+        <w:tblLook w:firstColumn="1" w:firstRow="1" w:lastColumn="0" w:lastRow="0" w:noHBand="0" w:noVBand="1" w:val="04A0"/>
+      </w:tblPr>
+      <w:tblGrid>
+        <w:gridCol w:w="1080"/>
+        <w:gridCol w:w="1080"/>
+        <w:gridCol w:w="1080"/>
+        <w:gridCol w:w="1080"/>
+        <w:gridCol w:w="1080"/>
+        <w:gridCol w:w="1080"/>
+        <w:gridCol w:w="1080"/>
+        <w:gridCol w:w="1080"/>
+      </w:tblGrid>
+      <w:tr>
+        <w:tc>
+          <w:tcPr>
+            <w:tcW w:type="dxa" w:w="1080"/>
+          </w:tcPr>
+          <w:p>
+            <w:r>
+              <w:t>APEC ID</w:t>
+            </w:r>
+          </w:p>
+        </w:tc>
+        <w:tc>
+          <w:tcPr>
+            <w:tcW w:type="dxa" w:w="1080"/>
+          </w:tcPr>
+          <w:p>
+            <w:r>
+              <w:t>Name</w:t>
+            </w:r>
+          </w:p>
+        </w:tc>
+        <w:tc>
+          <w:tcPr>
+            <w:tcW w:type="dxa" w:w="1080"/>
+          </w:tcPr>
+          <w:p>
+            <w:r>
+              <w:t>Location</w:t>
+            </w:r>
+          </w:p>
+        </w:tc>
+        <w:tc>
+          <w:tcPr>
+            <w:tcW w:type="dxa" w:w="1080"/>
+          </w:tcPr>
+          <w:p>
+            <w:r>
+              <w:t>Concern type</w:t>
+            </w:r>
+          </w:p>
+        </w:tc>
+        <w:tc>
+          <w:tcPr>
+            <w:tcW w:type="dxa" w:w="1080"/>
+          </w:tcPr>
+          <w:p>
+            <w:r>
+              <w:t>Source</w:t>
+            </w:r>
+          </w:p>
+        </w:tc>
+        <w:tc>
+          <w:tcPr>
+            <w:tcW w:type="dxa" w:w="1080"/>
+          </w:tcPr>
+          <w:p>
+            <w:r>
+              <w:t>Evidence</w:t>
+            </w:r>
+          </w:p>
+        </w:tc>
+        <w:tc>
+          <w:tcPr>
+            <w:tcW w:type="dxa" w:w="1080"/>
+          </w:tcPr>
+          <w:p>
+            <w:r>
+              <w:t>Document</w:t>
+            </w:r>
+          </w:p>
+        </w:tc>
+        <w:tc>
+          <w:tcPr>
+            <w:tcW w:type="dxa" w:w="1080"/>
+          </w:tcPr>
+          <w:p>
+            <w:r>
+              <w:t>Phase II?</w:t>
+            </w:r>
+          </w:p>
+        </w:tc>
+      </w:tr>
+      <w:tr>
+        <w:tc>
+          <w:tcPr>
+            <w:tcW w:type="dxa" w:w="8640"/>
+            <w:gridSpan w:val="8"/>
+          </w:tcPr>
+          <w:p>
+            <w:r>
+              <w:t>{%tr for item in apecs %}</w:t>
+            </w:r>
+          </w:p>
+        </w:tc>
+      </w:tr>
+      <w:tr>
+        <w:tc>
+          <w:tcPr>
+            <w:tcW w:type="dxa" w:w="1080"/>
+          </w:tcPr>
+          <w:p>
+            <w:r>
+              <w:t>{{ item.apec_id }}</w:t>
+            </w:r>
+          </w:p>
+        </w:tc>
+        <w:tc>
+          <w:tcPr>
+            <w:tcW w:type="dxa" w:w="1080"/>
+          </w:tcPr>
+          <w:p>
+            <w:r>
+              <w:t>{{ item.apec_name }}</w:t>
+            </w:r>
+          </w:p>
+        </w:tc>
+        <w:tc>
+          <w:tcPr>
+            <w:tcW w:type="dxa" w:w="1080"/>
+          </w:tcPr>
+          <w:p>
+            <w:r>
+              <w:t>{{ item.location_description }}</w:t>
+            </w:r>
+          </w:p>
+        </w:tc>
+        <w:tc>
+          <w:tcPr>
+            <w:tcW w:type="dxa" w:w="1080"/>
+          </w:tcPr>
+          <w:p>
+            <w:r>
+              <w:t>{{ item.concern_type }}</w:t>
+            </w:r>
+          </w:p>
+        </w:tc>
+        <w:tc>
+          <w:tcPr>
+            <w:tcW w:type="dxa" w:w="1080"/>
+          </w:tcPr>
+          <w:p>
+            <w:r>
+              <w:t>{{ item.source_of_concern }}</w:t>
+            </w:r>
+          </w:p>
+        </w:tc>
+        <w:tc>
+          <w:tcPr>
+            <w:tcW w:type="dxa" w:w="1080"/>
+          </w:tcPr>
+          <w:p>
+            <w:r>
+              <w:t>{{ item.evidence_summary }}</w:t>
+            </w:r>
+          </w:p>
+        </w:tc>
+        <w:tc>
+          <w:tcPr>
+            <w:tcW w:type="dxa" w:w="1080"/>
+          </w:tcPr>
+          <w:p>
+            <w:r>
+              <w:t>{{ item.source_document }}</w:t>
+            </w:r>
+          </w:p>
+        </w:tc>
+        <w:tc>
+          <w:tcPr>
+            <w:tcW w:type="dxa" w:w="1080"/>
+          </w:tcPr>
+          <w:p>
+            <w:r>
+              <w:t>{{ item.phase2_recommended }}</w:t>
+            </w:r>
+          </w:p>
+        </w:tc>
+      </w:tr>
+      <w:tr>
+        <w:tc>
+          <w:tcPr>
+            <w:tcW w:type="dxa" w:w="8640"/>
+            <w:gridSpan w:val="8"/>
+          </w:tcPr>
+          <w:p>
+            <w:r>
+              <w:t>{%tr endfor %}</w:t>
+            </w:r>
+          </w:p>
+        </w:tc>
+      </w:tr>
+    </w:tbl>
     <w:p>
       <w:pPr>
         <w:pStyle w:val="Heading2"/>

</xml_diff>